<commit_message>
Finale Änderungen und alles nötige und wichtige ins Repo aufgenommen
</commit_message>
<xml_diff>
--- a/docs/Retrospektive.docx
+++ b/docs/Retrospektive.docx
@@ -490,7 +490,7 @@
     </w:p>
     <w:p>
       <w:r>
-        <w:t>split teilt eine Zelle nach einer angegebenen Textzeile auf. join verbindet ausgewählte Zellen gleichen Typs oder alle Code- beziehungsweise Markdown-Zellen. Die Reihenfolge bleibt erhalten und die Metadaten der ersten Zelle werden übernommen. Alte Code-Ausgaben werden zurückgesetzt. Für die Abgabe ist eine einzelne Windows-x64-EXE mit enthaltener .NET-Laufzeit vorgesehen.</w:t>
+        <w:t>split teilt eine Zelle nach einer angegebenen Textzeile auf. join verbindet ausgewählte Zellen gleichen Typs oder alle Code- beziehungsweise Markdown-Zellen. Die Reihenfolge bleibt erhalten und die Metadaten der ersten Zelle werden übernommen. Alte Code-Ausgaben werden zurückgesetzt.</w:t>
       </w:r>
     </w:p>
     <w:p>
@@ -544,31 +544,31 @@
         <w:spacing w:after="60"/>
       </w:pPr>
       <w:r>
+        <w:t xml:space="preserve">Jonas hat die Anzeige einzelner Zellen umgesetzt. Er </w:t>
+      </w:r>
+      <w:r>
+        <w:t>hat außerdem an der Zellbearbeitung gearbeitet</w:t>
+      </w:r>
+      <w:r>
+        <w:t xml:space="preserve"> sowie an Hilfe und Fehlerausgaben mit Catharina beteiligt</w:t>
+      </w:r>
+      <w:r>
+        <w:t xml:space="preserve"> und Bugfixes bearbeitet</w:t>
+      </w:r>
+      <w:r>
+        <w:t>.</w:t>
+      </w:r>
+    </w:p>
+    <w:p>
+      <w:pPr>
+        <w:numPr>
+          <w:ilvl w:val="0"/>
+          <w:numId w:val="2"/>
+        </w:numPr>
+        <w:spacing w:after="60"/>
+      </w:pPr>
+      <w:r>
         <w:lastRenderedPageBreak/>
-        <w:t xml:space="preserve">Jonas hat die Anzeige einzelner Zellen umgesetzt. Er </w:t>
-      </w:r>
-      <w:r>
-        <w:t>hat außerdem an der Zellbearbeitung gearbeitet</w:t>
-      </w:r>
-      <w:r>
-        <w:t xml:space="preserve"> sowie an Hilfe und Fehlerausgaben mit Catharina beteiligt</w:t>
-      </w:r>
-      <w:r>
-        <w:t xml:space="preserve"> und Bugfixes bearbeitet</w:t>
-      </w:r>
-      <w:r>
-        <w:t>.</w:t>
-      </w:r>
-    </w:p>
-    <w:p>
-      <w:pPr>
-        <w:numPr>
-          <w:ilvl w:val="0"/>
-          <w:numId w:val="2"/>
-        </w:numPr>
-        <w:spacing w:after="60"/>
-      </w:pPr>
-      <w:r>
         <w:t>Catharina</w:t>
       </w:r>
       <w:r>
@@ -630,103 +630,31 @@
           <w:lang w:val="en-US"/>
         </w:rPr>
       </w:pPr>
-      <w:proofErr w:type="spellStart"/>
       <w:r>
         <w:rPr>
           <w:lang w:val="en-US"/>
         </w:rPr>
-        <w:t>src</w:t>
-      </w:r>
-      <w:proofErr w:type="spellEnd"/>
-      <w:r>
+        <w:t>src/NotebookTools: Program.cs sowie Features, Notebook, Helper und Help</w:t>
+      </w:r>
+    </w:p>
+    <w:p>
+      <w:pPr>
+        <w:pStyle w:val="ListParagraph"/>
+        <w:numPr>
+          <w:ilvl w:val="0"/>
+          <w:numId w:val="2"/>
+        </w:numPr>
+        <w:spacing w:after="60"/>
         <w:rPr>
           <w:lang w:val="en-US"/>
         </w:rPr>
-        <w:t>/</w:t>
-      </w:r>
-      <w:proofErr w:type="spellStart"/>
+      </w:pPr>
       <w:r>
         <w:rPr>
           <w:lang w:val="en-US"/>
         </w:rPr>
-        <w:t>NotebookTools</w:t>
-      </w:r>
-      <w:proofErr w:type="spellEnd"/>
-      <w:r>
-        <w:rPr>
-          <w:lang w:val="en-US"/>
-        </w:rPr>
-        <w:t xml:space="preserve">: </w:t>
-      </w:r>
-      <w:proofErr w:type="spellStart"/>
-      <w:r>
-        <w:rPr>
-          <w:lang w:val="en-US"/>
-        </w:rPr>
-        <w:t>Program.cs</w:t>
-      </w:r>
-      <w:proofErr w:type="spellEnd"/>
-      <w:r>
-        <w:rPr>
-          <w:lang w:val="en-US"/>
-        </w:rPr>
-        <w:t xml:space="preserve"> </w:t>
-      </w:r>
-      <w:proofErr w:type="spellStart"/>
-      <w:r>
-        <w:rPr>
-          <w:lang w:val="en-US"/>
-        </w:rPr>
-        <w:t>sowie</w:t>
-      </w:r>
-      <w:proofErr w:type="spellEnd"/>
-      <w:r>
-        <w:rPr>
-          <w:lang w:val="en-US"/>
-        </w:rPr>
-        <w:t xml:space="preserve"> Features, Notebook, Helper und Help</w:t>
-      </w:r>
-    </w:p>
-    <w:p>
-      <w:pPr>
-        <w:pStyle w:val="ListParagraph"/>
-        <w:numPr>
-          <w:ilvl w:val="0"/>
-          <w:numId w:val="2"/>
-        </w:numPr>
-        <w:spacing w:after="60"/>
-        <w:rPr>
-          <w:lang w:val="en-US"/>
-        </w:rPr>
-      </w:pPr>
-      <w:r>
-        <w:rPr>
-          <w:lang w:val="en-US"/>
-        </w:rPr>
-        <w:t>tests/</w:t>
-      </w:r>
-      <w:proofErr w:type="spellStart"/>
-      <w:r>
-        <w:rPr>
-          <w:lang w:val="en-US"/>
-        </w:rPr>
-        <w:t>NotebookTools.Tests</w:t>
-      </w:r>
-      <w:proofErr w:type="spellEnd"/>
-      <w:r>
-        <w:rPr>
-          <w:lang w:val="en-US"/>
-        </w:rPr>
-        <w:t xml:space="preserve">: Unit Tests und </w:t>
-      </w:r>
-      <w:proofErr w:type="spellStart"/>
-      <w:r>
-        <w:rPr>
-          <w:lang w:val="en-US"/>
-        </w:rPr>
-        <w:t>Testdaten</w:t>
-      </w:r>
-      <w:proofErr w:type="spellEnd"/>
+        <w:t>tests/NotebookTools.Tests: Unit Tests und Testdaten</w:t>
+      </w:r>
     </w:p>
     <w:p>
       <w:pPr>

</xml_diff>